<commit_message>
Updates PKDI templates and logic for dynamic fields
Revises PKDI document templates to use dynamic placeholders for year, institution, and data details, replacing hardcoded values and static text.
Enhances document generation logic to populate these placeholders and handle per-row data for both 'lengkap' and 'sebagian' cases, including proper counts for data completeness.
Standardizes director's name and improves template hyperlink usage.

Improves flexibility and accuracy of generated letters for varying data and recipient contexts.
</commit_message>
<xml_diff>
--- a/diamond_web/fixtures/default_templates/surat_pkdi_nasional_internasional_lengkap.docx
+++ b/diamond_web/fixtures/default_templates/surat_pkdi_nasional_internasional_lengkap.docx
@@ -1,6 +1,6 @@
 
 <file path=word/document.xml><?xml version="1.0" encoding="utf-8"?>
-<w:document xmlns:wpc="http://schemas.microsoft.com/office/word/2010/wordprocessingCanvas" xmlns:cx="http://schemas.microsoft.com/office/drawing/2014/chartex" xmlns:cx1="http://schemas.microsoft.com/office/drawing/2015/9/8/chartex" xmlns:cx2="http://schemas.microsoft.com/office/drawing/2015/10/21/chartex" xmlns:cx3="http://schemas.microsoft.com/office/drawing/2016/5/9/chartex" xmlns:cx4="http://schemas.microsoft.com/office/drawing/2016/5/10/chartex" xmlns:cx5="http://schemas.microsoft.com/office/drawing/2016/5/11/chartex" xmlns:cx6="http://schemas.microsoft.com/office/drawing/2016/5/12/chartex" xmlns:cx7="http://schemas.microsoft.com/office/drawing/2016/5/13/chartex" xmlns:cx8="http://schemas.microsoft.com/office/drawing/2016/5/14/chartex" xmlns:mc="http://schemas.openxmlformats.org/markup-compatibility/2006" xmlns:aink="http://schemas.microsoft.com/office/drawing/2016/ink" xmlns:am3d="http://schemas.microsoft.com/office/drawing/2017/model3d" xmlns:o="urn:schemas-microsoft-com:office:office" xmlns:r="http://schemas.openxmlformats.org/officeDocument/2006/relationships" xmlns:m="http://schemas.openxmlformats.org/officeDocument/2006/math" xmlns:v="urn:schemas-microsoft-com:vml" xmlns:wp14="http://schemas.microsoft.com/office/word/2010/wordprocessingDrawing" xmlns:wp="http://schemas.openxmlformats.org/drawingml/2006/wordprocessingDrawing" xmlns:w10="urn:schemas-microsoft-com:office:word" xmlns:w="http://schemas.openxmlformats.org/wordprocessingml/2006/main" xmlns:w14="http://schemas.microsoft.com/office/word/2010/wordml" xmlns:w15="http://schemas.microsoft.com/office/word/2012/wordml" xmlns:w16cex="http://schemas.microsoft.com/office/word/2018/wordml/cex" xmlns:w16cid="http://schemas.microsoft.com/office/word/2016/wordml/cid" xmlns:w16="http://schemas.microsoft.com/office/word/2018/wordml" xmlns:w16sdtdh="http://schemas.microsoft.com/office/word/2020/wordml/sdtdatahash" xmlns:w16se="http://schemas.microsoft.com/office/word/2015/wordml/symex" xmlns:wpg="http://schemas.microsoft.com/office/word/2010/wordprocessingGroup" xmlns:wpi="http://schemas.microsoft.com/office/word/2010/wordprocessingInk" xmlns:wne="http://schemas.microsoft.com/office/word/2006/wordml" xmlns:wps="http://schemas.microsoft.com/office/word/2010/wordprocessingShape" mc:Ignorable="w14 w15 w16se w16cid w16 w16cex w16sdtdh wp14">
+<w:document xmlns:wpc="http://schemas.microsoft.com/office/word/2010/wordprocessingCanvas" xmlns:cx="http://schemas.microsoft.com/office/drawing/2014/chartex" xmlns:cx1="http://schemas.microsoft.com/office/drawing/2015/9/8/chartex" xmlns:cx2="http://schemas.microsoft.com/office/drawing/2015/10/21/chartex" xmlns:cx3="http://schemas.microsoft.com/office/drawing/2016/5/9/chartex" xmlns:cx4="http://schemas.microsoft.com/office/drawing/2016/5/10/chartex" xmlns:cx5="http://schemas.microsoft.com/office/drawing/2016/5/11/chartex" xmlns:cx6="http://schemas.microsoft.com/office/drawing/2016/5/12/chartex" xmlns:cx7="http://schemas.microsoft.com/office/drawing/2016/5/13/chartex" xmlns:cx8="http://schemas.microsoft.com/office/drawing/2016/5/14/chartex" xmlns:mc="http://schemas.openxmlformats.org/markup-compatibility/2006" xmlns:aink="http://schemas.microsoft.com/office/drawing/2016/ink" xmlns:am3d="http://schemas.microsoft.com/office/drawing/2017/model3d" xmlns:o="urn:schemas-microsoft-com:office:office" xmlns:oel="http://schemas.microsoft.com/office/2019/extlst" xmlns:r="http://schemas.openxmlformats.org/officeDocument/2006/relationships" xmlns:m="http://schemas.openxmlformats.org/officeDocument/2006/math" xmlns:v="urn:schemas-microsoft-com:vml" xmlns:wp14="http://schemas.microsoft.com/office/word/2010/wordprocessingDrawing" xmlns:wp="http://schemas.openxmlformats.org/drawingml/2006/wordprocessingDrawing" xmlns:w10="urn:schemas-microsoft-com:office:word" xmlns:w="http://schemas.openxmlformats.org/wordprocessingml/2006/main" xmlns:w14="http://schemas.microsoft.com/office/word/2010/wordml" xmlns:w15="http://schemas.microsoft.com/office/word/2012/wordml" xmlns:w16cex="http://schemas.microsoft.com/office/word/2018/wordml/cex" xmlns:w16cid="http://schemas.microsoft.com/office/word/2016/wordml/cid" xmlns:w16="http://schemas.microsoft.com/office/word/2018/wordml" xmlns:w16du="http://schemas.microsoft.com/office/word/2023/wordml/word16du" xmlns:w16sdtdh="http://schemas.microsoft.com/office/word/2020/wordml/sdtdatahash" xmlns:w16sdtfl="http://schemas.microsoft.com/office/word/2024/wordml/sdtformatlock" xmlns:w16se="http://schemas.microsoft.com/office/word/2015/wordml/symex" xmlns:wpg="http://schemas.microsoft.com/office/word/2010/wordprocessingGroup" xmlns:wpi="http://schemas.microsoft.com/office/word/2010/wordprocessingInk" xmlns:wne="http://schemas.microsoft.com/office/word/2006/wordml" xmlns:wps="http://schemas.microsoft.com/office/word/2010/wordprocessingShape" mc:Ignorable="w14 w15 w16se w16cid w16 w16cex w16sdtdh w16sdtfl w16du wp14">
   <w:body>
     <w:tbl>
       <w:tblPr>
@@ -112,14 +112,24 @@
                 <w:rFonts w:eastAsia="Arial"/>
               </w:rPr>
             </w:pPr>
-            <w:hyperlink r:id="rId9" w:history="1">
-              <w:r>
-                <w:rPr>
-                  <w:rFonts w:eastAsia="Arial"/>
-                </w:rPr>
-                <w:t>[@NomorND]</w:t>
-              </w:r>
-            </w:hyperlink>
+            <w:r>
+              <w:fldChar w:fldCharType="begin"/>
+            </w:r>
+            <w:r>
+              <w:instrText>HYPERLINK "file:///C:\\Users\\921002181\\Downloads\\%5b@NomorND%5d"</w:instrText>
+            </w:r>
+            <w:r>
+              <w:fldChar w:fldCharType="separate"/>
+            </w:r>
+            <w:r>
+              <w:rPr>
+                <w:rFonts w:eastAsia="Arial"/>
+              </w:rPr>
+              <w:t>[@NomorND]</w:t>
+            </w:r>
+            <w:r>
+              <w:fldChar w:fldCharType="end"/>
+            </w:r>
           </w:p>
         </w:tc>
         <w:tc>
@@ -344,14 +354,24 @@
                 <w:rFonts w:eastAsia="Arial"/>
               </w:rPr>
             </w:pPr>
-            <w:hyperlink r:id="rId11" w:history="1">
-              <w:r>
-                <w:rPr>
-                  <w:rFonts w:eastAsia="Arial"/>
-                </w:rPr>
-                <w:t>1 (satu) Lembar</w:t>
-              </w:r>
-            </w:hyperlink>
+            <w:r>
+              <w:fldChar w:fldCharType="begin"/>
+            </w:r>
+            <w:r>
+              <w:instrText>HYPERLINK "file:///C:\\Users\\921002181\\Downloads\\%5b@Lampiran%5d"</w:instrText>
+            </w:r>
+            <w:r>
+              <w:fldChar w:fldCharType="separate"/>
+            </w:r>
+            <w:r>
+              <w:rPr>
+                <w:rFonts w:eastAsia="Arial"/>
+              </w:rPr>
+              <w:t>1 (satu) Lembar</w:t>
+            </w:r>
+            <w:r>
+              <w:fldChar w:fldCharType="end"/>
+            </w:r>
           </w:p>
         </w:tc>
       </w:tr>
@@ -474,15 +494,28 @@
                 <w:rFonts w:eastAsia="Arial"/>
                 <w:lang w:val="en-US"/>
               </w:rPr>
-              <w:t xml:space="preserve">Tahun Data 2024 </w:t>
+              <w:t xml:space="preserve">Tahun Data </w:t>
             </w:r>
             <w:r>
               <w:rPr>
                 <w:rFonts w:eastAsia="Arial"/>
-                <w:highlight w:val="yellow"/>
-                <w:lang w:val="en-US"/>
-              </w:rPr>
-              <w:t>Kementerian ABC</w:t>
+                <w:lang w:val="en-US"/>
+              </w:rPr>
+              <w:t>{{tahun_data}}</w:t>
+            </w:r>
+            <w:r>
+              <w:rPr>
+                <w:rFonts w:eastAsia="Arial"/>
+                <w:lang w:val="en-US"/>
+              </w:rPr>
+              <w:t xml:space="preserve"> </w:t>
+            </w:r>
+            <w:r>
+              <w:rPr>
+                <w:rFonts w:eastAsia="Arial"/>
+                <w:lang w:val="en-US"/>
+              </w:rPr>
+              <w:t>{{nama_ilap}}</w:t>
             </w:r>
           </w:p>
         </w:tc>
@@ -514,7 +547,14 @@
           <w:highlight w:val="yellow"/>
           <w:lang w:val="en-US"/>
         </w:rPr>
-        <w:t>Pimpinan ILAP</w:t>
+        <w:t xml:space="preserve">Pimpinan </w:t>
+      </w:r>
+      <w:r>
+        <w:rPr>
+          <w:rFonts w:eastAsia="Arial"/>
+          <w:lang w:val="en-US"/>
+        </w:rPr>
+        <w:t>{{nama_ilap}}</w:t>
       </w:r>
       <w:r>
         <w:rPr>
@@ -668,7 +708,16 @@
               <w:rPr>
                 <w:lang w:val="en-US"/>
               </w:rPr>
-              <w:t>……………..</w:t>
+              <w:t>{{</w:t>
+            </w:r>
+            <w:r>
+              <w:t>nomor_surat_pengantar</w:t>
+            </w:r>
+            <w:r>
+              <w:rPr>
+                <w:lang w:val="en-US"/>
+              </w:rPr>
+              <w:t>}}</w:t>
             </w:r>
           </w:p>
         </w:tc>
@@ -736,7 +785,16 @@
               <w:rPr>
                 <w:lang w:val="en-US"/>
               </w:rPr>
-              <w:t>……………..</w:t>
+              <w:t>{{</w:t>
+            </w:r>
+            <w:r>
+              <w:t>tanggal_surat_pengantar</w:t>
+            </w:r>
+            <w:r>
+              <w:rPr>
+                <w:lang w:val="en-US"/>
+              </w:rPr>
+              <w:t>}}</w:t>
             </w:r>
           </w:p>
         </w:tc>
@@ -811,15 +869,26 @@
             </w:r>
             <w:r>
               <w:rPr>
-                <w:lang w:val="en-US"/>
-              </w:rPr>
-              <w:t>…</w:t>
-            </w:r>
-            <w:r>
-              <w:rPr>
-                <w:lang w:val="en-US"/>
-              </w:rPr>
-              <w:t>….</w:t>
+                <w:rFonts w:eastAsia="Arial" w:cs="Arial"/>
+                <w:noProof/>
+                <w:lang w:val="en-US"/>
+              </w:rPr>
+              <w:t>{{</w:t>
+            </w:r>
+            <w:r>
+              <w:rPr>
+                <w:rFonts w:eastAsia="Arial" w:cs="Arial"/>
+                <w:noProof/>
+              </w:rPr>
+              <w:t>tahun_data</w:t>
+            </w:r>
+            <w:r>
+              <w:rPr>
+                <w:rFonts w:eastAsia="Arial" w:cs="Arial"/>
+                <w:noProof/>
+                <w:lang w:val="en-US"/>
+              </w:rPr>
+              <w:t>}}</w:t>
             </w:r>
           </w:p>
         </w:tc>
@@ -887,7 +956,20 @@
               <w:rPr>
                 <w:lang w:val="en-US"/>
               </w:rPr>
-              <w:t>……………..</w:t>
+              <w:t>{{</w:t>
+            </w:r>
+            <w:r>
+              <w:rPr>
+                <w:rFonts w:eastAsia="Arial" w:cs="Arial"/>
+                <w:noProof/>
+              </w:rPr>
+              <w:t>tanggal_terima_dip</w:t>
+            </w:r>
+            <w:r>
+              <w:rPr>
+                <w:lang w:val="en-US"/>
+              </w:rPr>
+              <w:t>}}</w:t>
             </w:r>
           </w:p>
         </w:tc>
@@ -952,7 +1034,13 @@
               </w:rPr>
             </w:pPr>
             <w:r>
-              <w:t xml:space="preserve">Langsung </w:t>
+              <w:t>{{</w:t>
+            </w:r>
+            <w:r>
+              <w:t>cara_penyampaian</w:t>
+            </w:r>
+            <w:r>
+              <w:t>}}</w:t>
             </w:r>
           </w:p>
         </w:tc>
@@ -1347,7 +1435,7 @@
                 <w:lang w:val="en-GB"/>
               </w:rPr>
             </w:pPr>
-            <w:hyperlink r:id="rId12" w:history="1"/>
+            <w:hyperlink r:id="rId11" w:history="1"/>
           </w:p>
         </w:tc>
         <w:tc>
@@ -1365,7 +1453,7 @@
                 <w:lang w:val="en-GB"/>
               </w:rPr>
             </w:pPr>
-            <w:hyperlink r:id="rId13" w:history="1"/>
+            <w:hyperlink r:id="rId12" w:history="1"/>
           </w:p>
         </w:tc>
       </w:tr>
@@ -1527,29 +1615,8 @@
                 <w:lang w:val="en-US"/>
               </w:rPr>
             </w:pPr>
-            <w:hyperlink r:id="rId14" w:history="1">
-              <w:r>
-                <w:rPr>
-                  <w:rStyle w:val="Hyperlink"/>
-                  <w:rFonts w:cs="Arial"/>
-                  <w:noProof/>
-                  <w:color w:val="auto"/>
-                  <w:u w:val="none"/>
-                  <w:lang w:val="en-US"/>
-                </w:rPr>
-                <w:t>Max</w:t>
-              </w:r>
-            </w:hyperlink>
-            <w:r>
-              <w:rPr>
-                <w:rStyle w:val="Hyperlink"/>
-                <w:rFonts w:cs="Arial"/>
-                <w:noProof/>
-                <w:color w:val="auto"/>
-                <w:u w:val="none"/>
-                <w:lang w:val="en-US"/>
-              </w:rPr>
-              <w:t xml:space="preserve"> Darmawan</w:t>
+            <w:r>
+              <w:t>Eddy Wahyudi</w:t>
             </w:r>
           </w:p>
         </w:tc>
@@ -1627,7 +1694,7 @@
                 <w:rFonts w:eastAsia="Arial"/>
               </w:rPr>
             </w:pPr>
-            <w:hyperlink r:id="rId15" w:history="1"/>
+            <w:hyperlink r:id="rId13" w:history="1"/>
           </w:p>
         </w:tc>
       </w:tr>
@@ -1682,8 +1749,8 @@
           <w:szCs w:val="20"/>
         </w:rPr>
       </w:pPr>
-      <w:bookmarkStart w:id="2" w:name="_Hlk176870149"/>
-      <w:bookmarkStart w:id="3" w:name="_Hlk175592966"/>
+      <w:bookmarkStart w:id="2" w:name="_Hlk175592966"/>
+      <w:bookmarkStart w:id="3" w:name="_Hlk176870149"/>
       <w:r>
         <w:rPr>
           <w:sz w:val="20"/>
@@ -1762,7 +1829,7 @@
         </w:rPr>
         <w:t xml:space="preserve">: </w:t>
       </w:r>
-      <w:hyperlink r:id="rId16" w:history="1">
+      <w:hyperlink r:id="rId14" w:history="1">
         <w:r>
           <w:rPr>
             <w:rStyle w:val="Hyperlink"/>
@@ -1808,7 +1875,7 @@
         </w:rPr>
         <w:t xml:space="preserve">: </w:t>
       </w:r>
-      <w:hyperlink r:id="rId17" w:history="1">
+      <w:hyperlink r:id="rId15" w:history="1">
         <w:r>
           <w:rPr>
             <w:rFonts w:eastAsia="Arial" w:cs="Arial"/>
@@ -1859,11 +1926,11 @@
       </w:pPr>
       <w:r>
         <w:rPr>
-          <w:rFonts w:cs="Arial"/>
-          <w:highlight w:val="yellow"/>
+          <w:b/>
+          <w:bCs/>
           <w:lang w:val="en-US"/>
         </w:rPr>
-        <w:t>Nama ILAP</w:t>
+        <w:t>{{nama_ilap}}</w:t>
       </w:r>
     </w:p>
     <w:p>
@@ -1885,11 +1952,11 @@
         <w:tblLook w:val="04A0" w:firstRow="1" w:lastRow="0" w:firstColumn="1" w:lastColumn="0" w:noHBand="0" w:noVBand="1"/>
       </w:tblPr>
       <w:tblGrid>
-        <w:gridCol w:w="536"/>
-        <w:gridCol w:w="3434"/>
-        <w:gridCol w:w="1808"/>
-        <w:gridCol w:w="1984"/>
-        <w:gridCol w:w="1878"/>
+        <w:gridCol w:w="1671"/>
+        <w:gridCol w:w="2406"/>
+        <w:gridCol w:w="2392"/>
+        <w:gridCol w:w="3338"/>
+        <w:gridCol w:w="3066"/>
       </w:tblGrid>
       <w:tr>
         <w:trPr>
@@ -2110,7 +2177,6 @@
               <w:bottom w:val="single" w:sz="4" w:space="0" w:color="auto"/>
               <w:right w:val="single" w:sz="4" w:space="0" w:color="auto"/>
             </w:tcBorders>
-            <w:shd w:val="clear" w:color="auto" w:fill="auto"/>
           </w:tcPr>
           <w:p>
             <w:pPr>
@@ -2122,6 +2188,35 @@
                 <w:lang w:val="en-ID" w:eastAsia="en-ID"/>
               </w:rPr>
             </w:pPr>
+            <w:r>
+              <w:rPr>
+                <w:rFonts w:eastAsia="Times New Roman" w:cs="Arial"/>
+                <w:sz w:val="24"/>
+                <w:szCs w:val="24"/>
+                <w:lang w:val="en-ID" w:eastAsia="en-ID"/>
+              </w:rPr>
+              <w:t>{{</w:t>
+            </w:r>
+            <w:proofErr w:type="gramStart"/>
+            <w:r>
+              <w:rPr>
+                <w:rFonts w:eastAsia="Times New Roman" w:cs="Arial"/>
+                <w:sz w:val="24"/>
+                <w:szCs w:val="24"/>
+                <w:lang w:val="en-ID" w:eastAsia="en-ID"/>
+              </w:rPr>
+              <w:t>row.nomor</w:t>
+            </w:r>
+            <w:proofErr w:type="gramEnd"/>
+            <w:r>
+              <w:rPr>
+                <w:rFonts w:eastAsia="Times New Roman" w:cs="Arial"/>
+                <w:sz w:val="24"/>
+                <w:szCs w:val="24"/>
+                <w:lang w:val="en-ID" w:eastAsia="en-ID"/>
+              </w:rPr>
+              <w:t>}}</w:t>
+            </w:r>
           </w:p>
         </w:tc>
         <w:tc>
@@ -2133,7 +2228,6 @@
               <w:bottom w:val="single" w:sz="4" w:space="0" w:color="auto"/>
               <w:right w:val="single" w:sz="4" w:space="0" w:color="auto"/>
             </w:tcBorders>
-            <w:shd w:val="clear" w:color="auto" w:fill="auto"/>
           </w:tcPr>
           <w:p>
             <w:pPr>
@@ -2143,6 +2237,14 @@
                 <w:lang w:val="en-US" w:eastAsia="en-ID"/>
               </w:rPr>
             </w:pPr>
+            <w:r>
+              <w:rPr>
+                <w:rFonts w:eastAsia="Times New Roman" w:cs="Arial"/>
+                <w:color w:val="auto"/>
+                <w:lang w:val="en-US" w:eastAsia="en-ID"/>
+              </w:rPr>
+              <w:t>{{row.sub_jenis_data}}</w:t>
+            </w:r>
           </w:p>
         </w:tc>
         <w:tc>
@@ -2154,7 +2256,6 @@
               <w:bottom w:val="single" w:sz="4" w:space="0" w:color="auto"/>
               <w:right w:val="single" w:sz="4" w:space="0" w:color="auto"/>
             </w:tcBorders>
-            <w:shd w:val="clear" w:color="auto" w:fill="auto"/>
           </w:tcPr>
           <w:p>
             <w:pPr>
@@ -2166,6 +2267,35 @@
                 <w:lang w:val="en-US" w:eastAsia="en-ID"/>
               </w:rPr>
             </w:pPr>
+            <w:r>
+              <w:rPr>
+                <w:rFonts w:eastAsia="Times New Roman" w:cs="Arial"/>
+                <w:sz w:val="24"/>
+                <w:szCs w:val="24"/>
+                <w:lang w:val="en-US" w:eastAsia="en-ID"/>
+              </w:rPr>
+              <w:t>{{</w:t>
+            </w:r>
+            <w:proofErr w:type="gramStart"/>
+            <w:r>
+              <w:rPr>
+                <w:rFonts w:eastAsia="Times New Roman" w:cs="Arial"/>
+                <w:sz w:val="24"/>
+                <w:szCs w:val="24"/>
+                <w:lang w:val="en-US" w:eastAsia="en-ID"/>
+              </w:rPr>
+              <w:t>row.periode</w:t>
+            </w:r>
+            <w:proofErr w:type="gramEnd"/>
+            <w:r>
+              <w:rPr>
+                <w:rFonts w:eastAsia="Times New Roman" w:cs="Arial"/>
+                <w:sz w:val="24"/>
+                <w:szCs w:val="24"/>
+                <w:lang w:val="en-US" w:eastAsia="en-ID"/>
+              </w:rPr>
+              <w:t>_data}}</w:t>
+            </w:r>
           </w:p>
         </w:tc>
         <w:tc>
@@ -2177,7 +2307,6 @@
               <w:bottom w:val="single" w:sz="4" w:space="0" w:color="auto"/>
               <w:right w:val="single" w:sz="4" w:space="0" w:color="auto"/>
             </w:tcBorders>
-            <w:shd w:val="clear" w:color="auto" w:fill="auto"/>
           </w:tcPr>
           <w:p>
             <w:pPr>
@@ -2189,6 +2318,35 @@
                 <w:lang w:val="en-US" w:eastAsia="en-ID"/>
               </w:rPr>
             </w:pPr>
+            <w:r>
+              <w:rPr>
+                <w:rFonts w:eastAsia="Times New Roman" w:cs="Arial"/>
+                <w:sz w:val="24"/>
+                <w:szCs w:val="24"/>
+                <w:lang w:val="en-US" w:eastAsia="en-ID"/>
+              </w:rPr>
+              <w:t>{{</w:t>
+            </w:r>
+            <w:proofErr w:type="gramStart"/>
+            <w:r>
+              <w:rPr>
+                <w:rFonts w:eastAsia="Times New Roman" w:cs="Arial"/>
+                <w:sz w:val="24"/>
+                <w:szCs w:val="24"/>
+                <w:lang w:val="en-US" w:eastAsia="en-ID"/>
+              </w:rPr>
+              <w:t>row.jumlah</w:t>
+            </w:r>
+            <w:proofErr w:type="gramEnd"/>
+            <w:r>
+              <w:rPr>
+                <w:rFonts w:eastAsia="Times New Roman" w:cs="Arial"/>
+                <w:sz w:val="24"/>
+                <w:szCs w:val="24"/>
+                <w:lang w:val="en-US" w:eastAsia="en-ID"/>
+              </w:rPr>
+              <w:t>_baris_diterima}}</w:t>
+            </w:r>
           </w:p>
         </w:tc>
         <w:tc>
@@ -2209,337 +2367,16 @@
                 <w:lang w:val="en-US"/>
               </w:rPr>
             </w:pPr>
+            <w:r>
+              <w:rPr>
+                <w:rFonts w:cs="Arial"/>
+              </w:rPr>
+              <w:t>{{row.jumlah_baris_lengkap}}</w:t>
+            </w:r>
           </w:p>
         </w:tc>
       </w:tr>
-      <w:tr>
-        <w:trPr>
-          <w:trHeight w:val="382"/>
-        </w:trPr>
-        <w:tc>
-          <w:tcPr>
-            <w:tcW w:w="536" w:type="dxa"/>
-            <w:tcBorders>
-              <w:top w:val="single" w:sz="4" w:space="0" w:color="auto"/>
-              <w:left w:val="single" w:sz="4" w:space="0" w:color="auto"/>
-              <w:bottom w:val="single" w:sz="4" w:space="0" w:color="auto"/>
-              <w:right w:val="single" w:sz="4" w:space="0" w:color="auto"/>
-            </w:tcBorders>
-            <w:shd w:val="clear" w:color="auto" w:fill="auto"/>
-          </w:tcPr>
-          <w:p>
-            <w:pPr>
-              <w:jc w:val="center"/>
-              <w:rPr>
-                <w:rFonts w:eastAsia="Times New Roman" w:cs="Arial"/>
-                <w:sz w:val="24"/>
-                <w:szCs w:val="24"/>
-                <w:lang w:val="en-ID" w:eastAsia="en-ID"/>
-              </w:rPr>
-            </w:pPr>
-          </w:p>
-        </w:tc>
-        <w:tc>
-          <w:tcPr>
-            <w:tcW w:w="3434" w:type="dxa"/>
-            <w:tcBorders>
-              <w:top w:val="single" w:sz="4" w:space="0" w:color="auto"/>
-              <w:left w:val="nil"/>
-              <w:bottom w:val="single" w:sz="4" w:space="0" w:color="auto"/>
-              <w:right w:val="single" w:sz="4" w:space="0" w:color="auto"/>
-            </w:tcBorders>
-            <w:shd w:val="clear" w:color="auto" w:fill="auto"/>
-          </w:tcPr>
-          <w:p>
-            <w:pPr>
-              <w:rPr>
-                <w:rFonts w:cs="Arial"/>
-              </w:rPr>
-            </w:pPr>
-          </w:p>
-        </w:tc>
-        <w:tc>
-          <w:tcPr>
-            <w:tcW w:w="1808" w:type="dxa"/>
-            <w:tcBorders>
-              <w:top w:val="single" w:sz="4" w:space="0" w:color="auto"/>
-              <w:left w:val="nil"/>
-              <w:bottom w:val="single" w:sz="4" w:space="0" w:color="auto"/>
-              <w:right w:val="single" w:sz="4" w:space="0" w:color="auto"/>
-            </w:tcBorders>
-            <w:shd w:val="clear" w:color="auto" w:fill="auto"/>
-          </w:tcPr>
-          <w:p>
-            <w:pPr>
-              <w:jc w:val="center"/>
-              <w:rPr>
-                <w:rFonts w:cs="Arial"/>
-              </w:rPr>
-            </w:pPr>
-          </w:p>
-        </w:tc>
-        <w:tc>
-          <w:tcPr>
-            <w:tcW w:w="1984" w:type="dxa"/>
-            <w:tcBorders>
-              <w:top w:val="single" w:sz="4" w:space="0" w:color="auto"/>
-              <w:left w:val="nil"/>
-              <w:bottom w:val="single" w:sz="4" w:space="0" w:color="auto"/>
-              <w:right w:val="single" w:sz="4" w:space="0" w:color="auto"/>
-            </w:tcBorders>
-            <w:shd w:val="clear" w:color="auto" w:fill="auto"/>
-          </w:tcPr>
-          <w:p>
-            <w:pPr>
-              <w:jc w:val="center"/>
-              <w:rPr>
-                <w:rFonts w:cs="Arial"/>
-                <w:lang w:val="en-US"/>
-              </w:rPr>
-            </w:pPr>
-          </w:p>
-        </w:tc>
-        <w:tc>
-          <w:tcPr>
-            <w:tcW w:w="1878" w:type="dxa"/>
-            <w:tcBorders>
-              <w:top w:val="single" w:sz="4" w:space="0" w:color="auto"/>
-              <w:left w:val="nil"/>
-              <w:bottom w:val="single" w:sz="4" w:space="0" w:color="auto"/>
-              <w:right w:val="single" w:sz="4" w:space="0" w:color="auto"/>
-            </w:tcBorders>
-          </w:tcPr>
-          <w:p>
-            <w:pPr>
-              <w:jc w:val="center"/>
-              <w:rPr>
-                <w:rFonts w:cs="Arial"/>
-                <w:lang w:val="en-US"/>
-              </w:rPr>
-            </w:pPr>
-          </w:p>
-        </w:tc>
-      </w:tr>
-      <w:tr>
-        <w:trPr>
-          <w:trHeight w:val="382"/>
-        </w:trPr>
-        <w:tc>
-          <w:tcPr>
-            <w:tcW w:w="536" w:type="dxa"/>
-            <w:tcBorders>
-              <w:top w:val="single" w:sz="4" w:space="0" w:color="auto"/>
-              <w:left w:val="single" w:sz="4" w:space="0" w:color="auto"/>
-              <w:bottom w:val="single" w:sz="4" w:space="0" w:color="auto"/>
-              <w:right w:val="single" w:sz="4" w:space="0" w:color="auto"/>
-            </w:tcBorders>
-            <w:shd w:val="clear" w:color="auto" w:fill="auto"/>
-          </w:tcPr>
-          <w:p>
-            <w:pPr>
-              <w:jc w:val="center"/>
-              <w:rPr>
-                <w:rFonts w:eastAsia="Times New Roman" w:cs="Arial"/>
-                <w:sz w:val="24"/>
-                <w:szCs w:val="24"/>
-                <w:lang w:val="en-ID" w:eastAsia="en-ID"/>
-              </w:rPr>
-            </w:pPr>
-          </w:p>
-        </w:tc>
-        <w:tc>
-          <w:tcPr>
-            <w:tcW w:w="3434" w:type="dxa"/>
-            <w:tcBorders>
-              <w:top w:val="single" w:sz="4" w:space="0" w:color="auto"/>
-              <w:left w:val="nil"/>
-              <w:bottom w:val="single" w:sz="4" w:space="0" w:color="auto"/>
-              <w:right w:val="single" w:sz="4" w:space="0" w:color="auto"/>
-            </w:tcBorders>
-            <w:shd w:val="clear" w:color="auto" w:fill="auto"/>
-          </w:tcPr>
-          <w:p>
-            <w:pPr>
-              <w:rPr>
-                <w:rFonts w:cs="Arial"/>
-              </w:rPr>
-            </w:pPr>
-          </w:p>
-        </w:tc>
-        <w:tc>
-          <w:tcPr>
-            <w:tcW w:w="1808" w:type="dxa"/>
-            <w:tcBorders>
-              <w:top w:val="single" w:sz="4" w:space="0" w:color="auto"/>
-              <w:left w:val="nil"/>
-              <w:bottom w:val="single" w:sz="4" w:space="0" w:color="auto"/>
-              <w:right w:val="single" w:sz="4" w:space="0" w:color="auto"/>
-            </w:tcBorders>
-            <w:shd w:val="clear" w:color="auto" w:fill="auto"/>
-          </w:tcPr>
-          <w:p>
-            <w:pPr>
-              <w:jc w:val="center"/>
-              <w:rPr>
-                <w:rFonts w:cs="Arial"/>
-              </w:rPr>
-            </w:pPr>
-          </w:p>
-        </w:tc>
-        <w:tc>
-          <w:tcPr>
-            <w:tcW w:w="1984" w:type="dxa"/>
-            <w:tcBorders>
-              <w:top w:val="single" w:sz="4" w:space="0" w:color="auto"/>
-              <w:left w:val="nil"/>
-              <w:bottom w:val="single" w:sz="4" w:space="0" w:color="auto"/>
-              <w:right w:val="single" w:sz="4" w:space="0" w:color="auto"/>
-            </w:tcBorders>
-            <w:shd w:val="clear" w:color="auto" w:fill="auto"/>
-          </w:tcPr>
-          <w:p>
-            <w:pPr>
-              <w:jc w:val="center"/>
-              <w:rPr>
-                <w:rFonts w:cs="Arial"/>
-                <w:lang w:val="en-US"/>
-              </w:rPr>
-            </w:pPr>
-          </w:p>
-        </w:tc>
-        <w:tc>
-          <w:tcPr>
-            <w:tcW w:w="1878" w:type="dxa"/>
-            <w:tcBorders>
-              <w:top w:val="single" w:sz="4" w:space="0" w:color="auto"/>
-              <w:left w:val="nil"/>
-              <w:bottom w:val="single" w:sz="4" w:space="0" w:color="auto"/>
-              <w:right w:val="single" w:sz="4" w:space="0" w:color="auto"/>
-            </w:tcBorders>
-          </w:tcPr>
-          <w:p>
-            <w:pPr>
-              <w:jc w:val="center"/>
-              <w:rPr>
-                <w:rFonts w:cs="Arial"/>
-                <w:lang w:val="en-US"/>
-              </w:rPr>
-            </w:pPr>
-          </w:p>
-        </w:tc>
-      </w:tr>
-      <w:tr>
-        <w:trPr>
-          <w:trHeight w:val="382"/>
-        </w:trPr>
-        <w:tc>
-          <w:tcPr>
-            <w:tcW w:w="536" w:type="dxa"/>
-            <w:tcBorders>
-              <w:top w:val="single" w:sz="4" w:space="0" w:color="auto"/>
-              <w:left w:val="single" w:sz="4" w:space="0" w:color="auto"/>
-              <w:bottom w:val="single" w:sz="4" w:space="0" w:color="auto"/>
-              <w:right w:val="single" w:sz="4" w:space="0" w:color="auto"/>
-            </w:tcBorders>
-            <w:shd w:val="clear" w:color="auto" w:fill="auto"/>
-          </w:tcPr>
-          <w:p>
-            <w:pPr>
-              <w:jc w:val="center"/>
-              <w:rPr>
-                <w:rFonts w:eastAsia="Times New Roman" w:cs="Arial"/>
-                <w:sz w:val="24"/>
-                <w:szCs w:val="24"/>
-                <w:lang w:val="en-ID" w:eastAsia="en-ID"/>
-              </w:rPr>
-            </w:pPr>
-          </w:p>
-        </w:tc>
-        <w:tc>
-          <w:tcPr>
-            <w:tcW w:w="3434" w:type="dxa"/>
-            <w:tcBorders>
-              <w:top w:val="single" w:sz="4" w:space="0" w:color="auto"/>
-              <w:left w:val="nil"/>
-              <w:bottom w:val="single" w:sz="4" w:space="0" w:color="auto"/>
-              <w:right w:val="single" w:sz="4" w:space="0" w:color="auto"/>
-            </w:tcBorders>
-            <w:shd w:val="clear" w:color="auto" w:fill="auto"/>
-          </w:tcPr>
-          <w:p>
-            <w:pPr>
-              <w:rPr>
-                <w:rFonts w:cs="Arial"/>
-                <w:sz w:val="20"/>
-                <w:szCs w:val="20"/>
-              </w:rPr>
-            </w:pPr>
-          </w:p>
-        </w:tc>
-        <w:tc>
-          <w:tcPr>
-            <w:tcW w:w="1808" w:type="dxa"/>
-            <w:tcBorders>
-              <w:top w:val="single" w:sz="4" w:space="0" w:color="auto"/>
-              <w:left w:val="nil"/>
-              <w:bottom w:val="single" w:sz="4" w:space="0" w:color="auto"/>
-              <w:right w:val="single" w:sz="4" w:space="0" w:color="auto"/>
-            </w:tcBorders>
-            <w:shd w:val="clear" w:color="auto" w:fill="auto"/>
-          </w:tcPr>
-          <w:p>
-            <w:pPr>
-              <w:jc w:val="center"/>
-              <w:rPr>
-                <w:rFonts w:cs="Arial"/>
-                <w:lang w:val="en-US"/>
-              </w:rPr>
-            </w:pPr>
-          </w:p>
-        </w:tc>
-        <w:tc>
-          <w:tcPr>
-            <w:tcW w:w="1984" w:type="dxa"/>
-            <w:tcBorders>
-              <w:top w:val="single" w:sz="4" w:space="0" w:color="auto"/>
-              <w:left w:val="nil"/>
-              <w:bottom w:val="single" w:sz="4" w:space="0" w:color="auto"/>
-              <w:right w:val="single" w:sz="4" w:space="0" w:color="auto"/>
-            </w:tcBorders>
-            <w:shd w:val="clear" w:color="auto" w:fill="auto"/>
-          </w:tcPr>
-          <w:p>
-            <w:pPr>
-              <w:jc w:val="center"/>
-              <w:rPr>
-                <w:rFonts w:cs="Arial"/>
-                <w:lang w:val="en-US"/>
-              </w:rPr>
-            </w:pPr>
-          </w:p>
-        </w:tc>
-        <w:tc>
-          <w:tcPr>
-            <w:tcW w:w="1878" w:type="dxa"/>
-            <w:tcBorders>
-              <w:top w:val="single" w:sz="4" w:space="0" w:color="auto"/>
-              <w:left w:val="nil"/>
-              <w:bottom w:val="single" w:sz="4" w:space="0" w:color="auto"/>
-              <w:right w:val="single" w:sz="4" w:space="0" w:color="auto"/>
-            </w:tcBorders>
-          </w:tcPr>
-          <w:p>
-            <w:pPr>
-              <w:jc w:val="center"/>
-              <w:rPr>
-                <w:rFonts w:cs="Arial"/>
-                <w:lang w:val="en-US"/>
-              </w:rPr>
-            </w:pPr>
-          </w:p>
-        </w:tc>
-      </w:tr>
-      <w:bookmarkEnd w:id="2"/>
+      <w:bookmarkEnd w:id="3"/>
     </w:tbl>
     <w:p>
       <w:pPr>
@@ -2760,17 +2597,14 @@
           </w:tcPr>
           <w:p>
             <w:pPr>
+              <w:ind w:left="-103"/>
               <w:rPr>
                 <w:rStyle w:val="Hyperlink"/>
-                <w:rFonts w:cs="Arial"/>
-                <w:noProof/>
-                <w:color w:val="000000"/>
-                <w:u w:val="none"/>
-                <w:lang w:val="en-US"/>
-              </w:rPr>
-            </w:pPr>
-            <w:r>
-              <w:t>Max Darmawan</w:t>
+                <w:noProof/>
+              </w:rPr>
+            </w:pPr>
+            <w:r>
+              <w:t>Eddy Wahyudi</w:t>
             </w:r>
           </w:p>
           <w:p>
@@ -2804,15 +2638,6 @@
             <w:pPr>
               <w:ind w:left="-103"/>
               <w:rPr>
-                <w:rStyle w:val="Hyperlink"/>
-                <w:noProof/>
-              </w:rPr>
-            </w:pPr>
-          </w:p>
-          <w:p>
-            <w:pPr>
-              <w:ind w:left="-103"/>
-              <w:rPr>
                 <w:rFonts w:eastAsia="Arial" w:cs="Arial"/>
                 <w:noProof/>
               </w:rPr>
@@ -2820,7 +2645,7 @@
           </w:p>
         </w:tc>
       </w:tr>
-      <w:bookmarkEnd w:id="3"/>
+      <w:bookmarkEnd w:id="2"/>
     </w:tbl>
     <w:p>
       <w:pPr>
@@ -2835,8 +2660,8 @@
       </w:pPr>
     </w:p>
     <w:sectPr>
-      <w:headerReference w:type="default" r:id="rId18"/>
-      <w:headerReference w:type="first" r:id="rId19"/>
+      <w:headerReference w:type="default" r:id="rId16"/>
+      <w:headerReference w:type="first" r:id="rId17"/>
       <w:pgSz w:w="11906" w:h="16838"/>
       <w:pgMar w:top="1134" w:right="1134" w:bottom="1134" w:left="1418" w:header="720" w:footer="720" w:gutter="0"/>
       <w:cols w:space="0"/>
@@ -2848,7 +2673,7 @@
 </file>
 
 <file path=word/endnotes.xml><?xml version="1.0" encoding="utf-8"?>
-<w:endnotes xmlns:wpc="http://schemas.microsoft.com/office/word/2010/wordprocessingCanvas" xmlns:cx="http://schemas.microsoft.com/office/drawing/2014/chartex" xmlns:cx1="http://schemas.microsoft.com/office/drawing/2015/9/8/chartex" xmlns:cx2="http://schemas.microsoft.com/office/drawing/2015/10/21/chartex" xmlns:cx3="http://schemas.microsoft.com/office/drawing/2016/5/9/chartex" xmlns:cx4="http://schemas.microsoft.com/office/drawing/2016/5/10/chartex" xmlns:cx5="http://schemas.microsoft.com/office/drawing/2016/5/11/chartex" xmlns:cx6="http://schemas.microsoft.com/office/drawing/2016/5/12/chartex" xmlns:cx7="http://schemas.microsoft.com/office/drawing/2016/5/13/chartex" xmlns:cx8="http://schemas.microsoft.com/office/drawing/2016/5/14/chartex" xmlns:mc="http://schemas.openxmlformats.org/markup-compatibility/2006" xmlns:aink="http://schemas.microsoft.com/office/drawing/2016/ink" xmlns:am3d="http://schemas.microsoft.com/office/drawing/2017/model3d" xmlns:o="urn:schemas-microsoft-com:office:office" xmlns:r="http://schemas.openxmlformats.org/officeDocument/2006/relationships" xmlns:m="http://schemas.openxmlformats.org/officeDocument/2006/math" xmlns:v="urn:schemas-microsoft-com:vml" xmlns:wp14="http://schemas.microsoft.com/office/word/2010/wordprocessingDrawing" xmlns:wp="http://schemas.openxmlformats.org/drawingml/2006/wordprocessingDrawing" xmlns:w10="urn:schemas-microsoft-com:office:word" xmlns:w="http://schemas.openxmlformats.org/wordprocessingml/2006/main" xmlns:w14="http://schemas.microsoft.com/office/word/2010/wordml" xmlns:w15="http://schemas.microsoft.com/office/word/2012/wordml" xmlns:w16cex="http://schemas.microsoft.com/office/word/2018/wordml/cex" xmlns:w16cid="http://schemas.microsoft.com/office/word/2016/wordml/cid" xmlns:w16="http://schemas.microsoft.com/office/word/2018/wordml" xmlns:w16sdtdh="http://schemas.microsoft.com/office/word/2020/wordml/sdtdatahash" xmlns:w16se="http://schemas.microsoft.com/office/word/2015/wordml/symex" xmlns:wpg="http://schemas.microsoft.com/office/word/2010/wordprocessingGroup" xmlns:wpi="http://schemas.microsoft.com/office/word/2010/wordprocessingInk" xmlns:wne="http://schemas.microsoft.com/office/word/2006/wordml" xmlns:wps="http://schemas.microsoft.com/office/word/2010/wordprocessingShape" mc:Ignorable="w14 w15 w16se w16cid w16 w16cex w16sdtdh wp14">
+<w:endnotes xmlns:wpc="http://schemas.microsoft.com/office/word/2010/wordprocessingCanvas" xmlns:cx="http://schemas.microsoft.com/office/drawing/2014/chartex" xmlns:cx1="http://schemas.microsoft.com/office/drawing/2015/9/8/chartex" xmlns:cx2="http://schemas.microsoft.com/office/drawing/2015/10/21/chartex" xmlns:cx3="http://schemas.microsoft.com/office/drawing/2016/5/9/chartex" xmlns:cx4="http://schemas.microsoft.com/office/drawing/2016/5/10/chartex" xmlns:cx5="http://schemas.microsoft.com/office/drawing/2016/5/11/chartex" xmlns:cx6="http://schemas.microsoft.com/office/drawing/2016/5/12/chartex" xmlns:cx7="http://schemas.microsoft.com/office/drawing/2016/5/13/chartex" xmlns:cx8="http://schemas.microsoft.com/office/drawing/2016/5/14/chartex" xmlns:mc="http://schemas.openxmlformats.org/markup-compatibility/2006" xmlns:aink="http://schemas.microsoft.com/office/drawing/2016/ink" xmlns:am3d="http://schemas.microsoft.com/office/drawing/2017/model3d" xmlns:o="urn:schemas-microsoft-com:office:office" xmlns:oel="http://schemas.microsoft.com/office/2019/extlst" xmlns:r="http://schemas.openxmlformats.org/officeDocument/2006/relationships" xmlns:m="http://schemas.openxmlformats.org/officeDocument/2006/math" xmlns:v="urn:schemas-microsoft-com:vml" xmlns:wp14="http://schemas.microsoft.com/office/word/2010/wordprocessingDrawing" xmlns:wp="http://schemas.openxmlformats.org/drawingml/2006/wordprocessingDrawing" xmlns:w10="urn:schemas-microsoft-com:office:word" xmlns:w="http://schemas.openxmlformats.org/wordprocessingml/2006/main" xmlns:w14="http://schemas.microsoft.com/office/word/2010/wordml" xmlns:w15="http://schemas.microsoft.com/office/word/2012/wordml" xmlns:w16cex="http://schemas.microsoft.com/office/word/2018/wordml/cex" xmlns:w16cid="http://schemas.microsoft.com/office/word/2016/wordml/cid" xmlns:w16="http://schemas.microsoft.com/office/word/2018/wordml" xmlns:w16du="http://schemas.microsoft.com/office/word/2023/wordml/word16du" xmlns:w16sdtdh="http://schemas.microsoft.com/office/word/2020/wordml/sdtdatahash" xmlns:w16sdtfl="http://schemas.microsoft.com/office/word/2024/wordml/sdtformatlock" xmlns:w16se="http://schemas.microsoft.com/office/word/2015/wordml/symex" xmlns:wpg="http://schemas.microsoft.com/office/word/2010/wordprocessingGroup" xmlns:wpi="http://schemas.microsoft.com/office/word/2010/wordprocessingInk" xmlns:wne="http://schemas.microsoft.com/office/word/2006/wordml" xmlns:wps="http://schemas.microsoft.com/office/word/2010/wordprocessingShape" mc:Ignorable="w14 w15 w16se w16cid w16 w16cex w16sdtdh w16sdtfl w16du wp14">
   <w:endnote w:type="separator" w:id="-1">
     <w:p>
       <w:r>
@@ -2867,7 +2692,7 @@
 </file>
 
 <file path=word/footnotes.xml><?xml version="1.0" encoding="utf-8"?>
-<w:footnotes xmlns:wpc="http://schemas.microsoft.com/office/word/2010/wordprocessingCanvas" xmlns:cx="http://schemas.microsoft.com/office/drawing/2014/chartex" xmlns:cx1="http://schemas.microsoft.com/office/drawing/2015/9/8/chartex" xmlns:cx2="http://schemas.microsoft.com/office/drawing/2015/10/21/chartex" xmlns:cx3="http://schemas.microsoft.com/office/drawing/2016/5/9/chartex" xmlns:cx4="http://schemas.microsoft.com/office/drawing/2016/5/10/chartex" xmlns:cx5="http://schemas.microsoft.com/office/drawing/2016/5/11/chartex" xmlns:cx6="http://schemas.microsoft.com/office/drawing/2016/5/12/chartex" xmlns:cx7="http://schemas.microsoft.com/office/drawing/2016/5/13/chartex" xmlns:cx8="http://schemas.microsoft.com/office/drawing/2016/5/14/chartex" xmlns:mc="http://schemas.openxmlformats.org/markup-compatibility/2006" xmlns:aink="http://schemas.microsoft.com/office/drawing/2016/ink" xmlns:am3d="http://schemas.microsoft.com/office/drawing/2017/model3d" xmlns:o="urn:schemas-microsoft-com:office:office" xmlns:r="http://schemas.openxmlformats.org/officeDocument/2006/relationships" xmlns:m="http://schemas.openxmlformats.org/officeDocument/2006/math" xmlns:v="urn:schemas-microsoft-com:vml" xmlns:wp14="http://schemas.microsoft.com/office/word/2010/wordprocessingDrawing" xmlns:wp="http://schemas.openxmlformats.org/drawingml/2006/wordprocessingDrawing" xmlns:w10="urn:schemas-microsoft-com:office:word" xmlns:w="http://schemas.openxmlformats.org/wordprocessingml/2006/main" xmlns:w14="http://schemas.microsoft.com/office/word/2010/wordml" xmlns:w15="http://schemas.microsoft.com/office/word/2012/wordml" xmlns:w16cex="http://schemas.microsoft.com/office/word/2018/wordml/cex" xmlns:w16cid="http://schemas.microsoft.com/office/word/2016/wordml/cid" xmlns:w16="http://schemas.microsoft.com/office/word/2018/wordml" xmlns:w16sdtdh="http://schemas.microsoft.com/office/word/2020/wordml/sdtdatahash" xmlns:w16se="http://schemas.microsoft.com/office/word/2015/wordml/symex" xmlns:wpg="http://schemas.microsoft.com/office/word/2010/wordprocessingGroup" xmlns:wpi="http://schemas.microsoft.com/office/word/2010/wordprocessingInk" xmlns:wne="http://schemas.microsoft.com/office/word/2006/wordml" xmlns:wps="http://schemas.microsoft.com/office/word/2010/wordprocessingShape" mc:Ignorable="w14 w15 w16se w16cid w16 w16cex w16sdtdh wp14">
+<w:footnotes xmlns:wpc="http://schemas.microsoft.com/office/word/2010/wordprocessingCanvas" xmlns:cx="http://schemas.microsoft.com/office/drawing/2014/chartex" xmlns:cx1="http://schemas.microsoft.com/office/drawing/2015/9/8/chartex" xmlns:cx2="http://schemas.microsoft.com/office/drawing/2015/10/21/chartex" xmlns:cx3="http://schemas.microsoft.com/office/drawing/2016/5/9/chartex" xmlns:cx4="http://schemas.microsoft.com/office/drawing/2016/5/10/chartex" xmlns:cx5="http://schemas.microsoft.com/office/drawing/2016/5/11/chartex" xmlns:cx6="http://schemas.microsoft.com/office/drawing/2016/5/12/chartex" xmlns:cx7="http://schemas.microsoft.com/office/drawing/2016/5/13/chartex" xmlns:cx8="http://schemas.microsoft.com/office/drawing/2016/5/14/chartex" xmlns:mc="http://schemas.openxmlformats.org/markup-compatibility/2006" xmlns:aink="http://schemas.microsoft.com/office/drawing/2016/ink" xmlns:am3d="http://schemas.microsoft.com/office/drawing/2017/model3d" xmlns:o="urn:schemas-microsoft-com:office:office" xmlns:oel="http://schemas.microsoft.com/office/2019/extlst" xmlns:r="http://schemas.openxmlformats.org/officeDocument/2006/relationships" xmlns:m="http://schemas.openxmlformats.org/officeDocument/2006/math" xmlns:v="urn:schemas-microsoft-com:vml" xmlns:wp14="http://schemas.microsoft.com/office/word/2010/wordprocessingDrawing" xmlns:wp="http://schemas.openxmlformats.org/drawingml/2006/wordprocessingDrawing" xmlns:w10="urn:schemas-microsoft-com:office:word" xmlns:w="http://schemas.openxmlformats.org/wordprocessingml/2006/main" xmlns:w14="http://schemas.microsoft.com/office/word/2010/wordml" xmlns:w15="http://schemas.microsoft.com/office/word/2012/wordml" xmlns:w16cex="http://schemas.microsoft.com/office/word/2018/wordml/cex" xmlns:w16cid="http://schemas.microsoft.com/office/word/2016/wordml/cid" xmlns:w16="http://schemas.microsoft.com/office/word/2018/wordml" xmlns:w16du="http://schemas.microsoft.com/office/word/2023/wordml/word16du" xmlns:w16sdtdh="http://schemas.microsoft.com/office/word/2020/wordml/sdtdatahash" xmlns:w16sdtfl="http://schemas.microsoft.com/office/word/2024/wordml/sdtformatlock" xmlns:w16se="http://schemas.microsoft.com/office/word/2015/wordml/symex" xmlns:wpg="http://schemas.microsoft.com/office/word/2010/wordprocessingGroup" xmlns:wpi="http://schemas.microsoft.com/office/word/2010/wordprocessingInk" xmlns:wne="http://schemas.microsoft.com/office/word/2006/wordml" xmlns:wps="http://schemas.microsoft.com/office/word/2010/wordprocessingShape" mc:Ignorable="w14 w15 w16se w16cid w16 w16cex w16sdtdh w16sdtfl w16du wp14">
   <w:footnote w:type="separator" w:id="-1">
     <w:p>
       <w:r>
@@ -2886,7 +2711,7 @@
 </file>
 
 <file path=word/header1.xml><?xml version="1.0" encoding="utf-8"?>
-<w:hdr xmlns:wpc="http://schemas.microsoft.com/office/word/2010/wordprocessingCanvas" xmlns:cx="http://schemas.microsoft.com/office/drawing/2014/chartex" xmlns:cx1="http://schemas.microsoft.com/office/drawing/2015/9/8/chartex" xmlns:cx2="http://schemas.microsoft.com/office/drawing/2015/10/21/chartex" xmlns:cx3="http://schemas.microsoft.com/office/drawing/2016/5/9/chartex" xmlns:cx4="http://schemas.microsoft.com/office/drawing/2016/5/10/chartex" xmlns:cx5="http://schemas.microsoft.com/office/drawing/2016/5/11/chartex" xmlns:cx6="http://schemas.microsoft.com/office/drawing/2016/5/12/chartex" xmlns:cx7="http://schemas.microsoft.com/office/drawing/2016/5/13/chartex" xmlns:cx8="http://schemas.microsoft.com/office/drawing/2016/5/14/chartex" xmlns:mc="http://schemas.openxmlformats.org/markup-compatibility/2006" xmlns:aink="http://schemas.microsoft.com/office/drawing/2016/ink" xmlns:am3d="http://schemas.microsoft.com/office/drawing/2017/model3d" xmlns:o="urn:schemas-microsoft-com:office:office" xmlns:r="http://schemas.openxmlformats.org/officeDocument/2006/relationships" xmlns:m="http://schemas.openxmlformats.org/officeDocument/2006/math" xmlns:v="urn:schemas-microsoft-com:vml" xmlns:wp14="http://schemas.microsoft.com/office/word/2010/wordprocessingDrawing" xmlns:wp="http://schemas.openxmlformats.org/drawingml/2006/wordprocessingDrawing" xmlns:w10="urn:schemas-microsoft-com:office:word" xmlns:w="http://schemas.openxmlformats.org/wordprocessingml/2006/main" xmlns:w14="http://schemas.microsoft.com/office/word/2010/wordml" xmlns:w15="http://schemas.microsoft.com/office/word/2012/wordml" xmlns:w16cex="http://schemas.microsoft.com/office/word/2018/wordml/cex" xmlns:w16cid="http://schemas.microsoft.com/office/word/2016/wordml/cid" xmlns:w16="http://schemas.microsoft.com/office/word/2018/wordml" xmlns:w16sdtdh="http://schemas.microsoft.com/office/word/2020/wordml/sdtdatahash" xmlns:w16se="http://schemas.microsoft.com/office/word/2015/wordml/symex" xmlns:wpg="http://schemas.microsoft.com/office/word/2010/wordprocessingGroup" xmlns:wpi="http://schemas.microsoft.com/office/word/2010/wordprocessingInk" xmlns:wne="http://schemas.microsoft.com/office/word/2006/wordml" xmlns:wps="http://schemas.microsoft.com/office/word/2010/wordprocessingShape" mc:Ignorable="w14 w15 w16se w16cid w16 w16cex w16sdtdh wp14">
+<w:hdr xmlns:wpc="http://schemas.microsoft.com/office/word/2010/wordprocessingCanvas" xmlns:cx="http://schemas.microsoft.com/office/drawing/2014/chartex" xmlns:cx1="http://schemas.microsoft.com/office/drawing/2015/9/8/chartex" xmlns:cx2="http://schemas.microsoft.com/office/drawing/2015/10/21/chartex" xmlns:cx3="http://schemas.microsoft.com/office/drawing/2016/5/9/chartex" xmlns:cx4="http://schemas.microsoft.com/office/drawing/2016/5/10/chartex" xmlns:cx5="http://schemas.microsoft.com/office/drawing/2016/5/11/chartex" xmlns:cx6="http://schemas.microsoft.com/office/drawing/2016/5/12/chartex" xmlns:cx7="http://schemas.microsoft.com/office/drawing/2016/5/13/chartex" xmlns:cx8="http://schemas.microsoft.com/office/drawing/2016/5/14/chartex" xmlns:mc="http://schemas.openxmlformats.org/markup-compatibility/2006" xmlns:aink="http://schemas.microsoft.com/office/drawing/2016/ink" xmlns:am3d="http://schemas.microsoft.com/office/drawing/2017/model3d" xmlns:o="urn:schemas-microsoft-com:office:office" xmlns:oel="http://schemas.microsoft.com/office/2019/extlst" xmlns:r="http://schemas.openxmlformats.org/officeDocument/2006/relationships" xmlns:m="http://schemas.openxmlformats.org/officeDocument/2006/math" xmlns:v="urn:schemas-microsoft-com:vml" xmlns:wp14="http://schemas.microsoft.com/office/word/2010/wordprocessingDrawing" xmlns:wp="http://schemas.openxmlformats.org/drawingml/2006/wordprocessingDrawing" xmlns:w10="urn:schemas-microsoft-com:office:word" xmlns:w="http://schemas.openxmlformats.org/wordprocessingml/2006/main" xmlns:w14="http://schemas.microsoft.com/office/word/2010/wordml" xmlns:w15="http://schemas.microsoft.com/office/word/2012/wordml" xmlns:w16cex="http://schemas.microsoft.com/office/word/2018/wordml/cex" xmlns:w16cid="http://schemas.microsoft.com/office/word/2016/wordml/cid" xmlns:w16="http://schemas.microsoft.com/office/word/2018/wordml" xmlns:w16du="http://schemas.microsoft.com/office/word/2023/wordml/word16du" xmlns:w16sdtdh="http://schemas.microsoft.com/office/word/2020/wordml/sdtdatahash" xmlns:w16sdtfl="http://schemas.microsoft.com/office/word/2024/wordml/sdtformatlock" xmlns:w16se="http://schemas.microsoft.com/office/word/2015/wordml/symex" xmlns:wpg="http://schemas.microsoft.com/office/word/2010/wordprocessingGroup" xmlns:wpi="http://schemas.microsoft.com/office/word/2010/wordprocessingInk" xmlns:wne="http://schemas.microsoft.com/office/word/2006/wordml" xmlns:wps="http://schemas.microsoft.com/office/word/2010/wordprocessingShape" mc:Ignorable="w14 w15 w16se w16cid w16 w16cex w16sdtdh w16sdtfl w16du wp14">
   <w:p>
     <w:pPr>
       <w:jc w:val="center"/>
@@ -2927,7 +2752,7 @@
 </file>
 
 <file path=word/header2.xml><?xml version="1.0" encoding="utf-8"?>
-<w:hdr xmlns:wpc="http://schemas.microsoft.com/office/word/2010/wordprocessingCanvas" xmlns:cx="http://schemas.microsoft.com/office/drawing/2014/chartex" xmlns:cx1="http://schemas.microsoft.com/office/drawing/2015/9/8/chartex" xmlns:cx2="http://schemas.microsoft.com/office/drawing/2015/10/21/chartex" xmlns:cx3="http://schemas.microsoft.com/office/drawing/2016/5/9/chartex" xmlns:cx4="http://schemas.microsoft.com/office/drawing/2016/5/10/chartex" xmlns:cx5="http://schemas.microsoft.com/office/drawing/2016/5/11/chartex" xmlns:cx6="http://schemas.microsoft.com/office/drawing/2016/5/12/chartex" xmlns:cx7="http://schemas.microsoft.com/office/drawing/2016/5/13/chartex" xmlns:cx8="http://schemas.microsoft.com/office/drawing/2016/5/14/chartex" xmlns:mc="http://schemas.openxmlformats.org/markup-compatibility/2006" xmlns:aink="http://schemas.microsoft.com/office/drawing/2016/ink" xmlns:am3d="http://schemas.microsoft.com/office/drawing/2017/model3d" xmlns:o="urn:schemas-microsoft-com:office:office" xmlns:r="http://schemas.openxmlformats.org/officeDocument/2006/relationships" xmlns:m="http://schemas.openxmlformats.org/officeDocument/2006/math" xmlns:v="urn:schemas-microsoft-com:vml" xmlns:wp14="http://schemas.microsoft.com/office/word/2010/wordprocessingDrawing" xmlns:wp="http://schemas.openxmlformats.org/drawingml/2006/wordprocessingDrawing" xmlns:w10="urn:schemas-microsoft-com:office:word" xmlns:w="http://schemas.openxmlformats.org/wordprocessingml/2006/main" xmlns:w14="http://schemas.microsoft.com/office/word/2010/wordml" xmlns:w15="http://schemas.microsoft.com/office/word/2012/wordml" xmlns:w16cex="http://schemas.microsoft.com/office/word/2018/wordml/cex" xmlns:w16cid="http://schemas.microsoft.com/office/word/2016/wordml/cid" xmlns:w16="http://schemas.microsoft.com/office/word/2018/wordml" xmlns:w16sdtdh="http://schemas.microsoft.com/office/word/2020/wordml/sdtdatahash" xmlns:w16se="http://schemas.microsoft.com/office/word/2015/wordml/symex" xmlns:wpg="http://schemas.microsoft.com/office/word/2010/wordprocessingGroup" xmlns:wpi="http://schemas.microsoft.com/office/word/2010/wordprocessingInk" xmlns:wne="http://schemas.microsoft.com/office/word/2006/wordml" xmlns:wps="http://schemas.microsoft.com/office/word/2010/wordprocessingShape" mc:Ignorable="w14 w15 w16se w16cid w16 w16cex w16sdtdh wp14">
+<w:hdr xmlns:wpc="http://schemas.microsoft.com/office/word/2010/wordprocessingCanvas" xmlns:cx="http://schemas.microsoft.com/office/drawing/2014/chartex" xmlns:cx1="http://schemas.microsoft.com/office/drawing/2015/9/8/chartex" xmlns:cx2="http://schemas.microsoft.com/office/drawing/2015/10/21/chartex" xmlns:cx3="http://schemas.microsoft.com/office/drawing/2016/5/9/chartex" xmlns:cx4="http://schemas.microsoft.com/office/drawing/2016/5/10/chartex" xmlns:cx5="http://schemas.microsoft.com/office/drawing/2016/5/11/chartex" xmlns:cx6="http://schemas.microsoft.com/office/drawing/2016/5/12/chartex" xmlns:cx7="http://schemas.microsoft.com/office/drawing/2016/5/13/chartex" xmlns:cx8="http://schemas.microsoft.com/office/drawing/2016/5/14/chartex" xmlns:mc="http://schemas.openxmlformats.org/markup-compatibility/2006" xmlns:aink="http://schemas.microsoft.com/office/drawing/2016/ink" xmlns:am3d="http://schemas.microsoft.com/office/drawing/2017/model3d" xmlns:o="urn:schemas-microsoft-com:office:office" xmlns:oel="http://schemas.microsoft.com/office/2019/extlst" xmlns:r="http://schemas.openxmlformats.org/officeDocument/2006/relationships" xmlns:m="http://schemas.openxmlformats.org/officeDocument/2006/math" xmlns:v="urn:schemas-microsoft-com:vml" xmlns:wp14="http://schemas.microsoft.com/office/word/2010/wordprocessingDrawing" xmlns:wp="http://schemas.openxmlformats.org/drawingml/2006/wordprocessingDrawing" xmlns:w10="urn:schemas-microsoft-com:office:word" xmlns:w="http://schemas.openxmlformats.org/wordprocessingml/2006/main" xmlns:w14="http://schemas.microsoft.com/office/word/2010/wordml" xmlns:w15="http://schemas.microsoft.com/office/word/2012/wordml" xmlns:w16cex="http://schemas.microsoft.com/office/word/2018/wordml/cex" xmlns:w16cid="http://schemas.microsoft.com/office/word/2016/wordml/cid" xmlns:w16="http://schemas.microsoft.com/office/word/2018/wordml" xmlns:w16du="http://schemas.microsoft.com/office/word/2023/wordml/word16du" xmlns:w16sdtdh="http://schemas.microsoft.com/office/word/2020/wordml/sdtdatahash" xmlns:w16sdtfl="http://schemas.microsoft.com/office/word/2024/wordml/sdtformatlock" xmlns:w16se="http://schemas.microsoft.com/office/word/2015/wordml/symex" xmlns:wpg="http://schemas.microsoft.com/office/word/2010/wordprocessingGroup" xmlns:wpi="http://schemas.microsoft.com/office/word/2010/wordprocessingInk" xmlns:wne="http://schemas.microsoft.com/office/word/2006/wordml" xmlns:wps="http://schemas.microsoft.com/office/word/2010/wordprocessingShape" mc:Ignorable="w14 w15 w16se w16cid w16 w16cex w16sdtdh w16sdtfl w16du wp14">
   <w:tbl>
     <w:tblPr>
       <w:tblW w:w="9640" w:type="dxa"/>
@@ -3155,8 +2980,165 @@
 </w:hdr>
 </file>
 
+<file path=word/numbering.xml><?xml version="1.0" encoding="utf-8"?>
+<w:numbering xmlns:wpc="http://schemas.microsoft.com/office/word/2010/wordprocessingCanvas" xmlns:cx="http://schemas.microsoft.com/office/drawing/2014/chartex" xmlns:cx1="http://schemas.microsoft.com/office/drawing/2015/9/8/chartex" xmlns:cx2="http://schemas.microsoft.com/office/drawing/2015/10/21/chartex" xmlns:cx3="http://schemas.microsoft.com/office/drawing/2016/5/9/chartex" xmlns:cx4="http://schemas.microsoft.com/office/drawing/2016/5/10/chartex" xmlns:cx5="http://schemas.microsoft.com/office/drawing/2016/5/11/chartex" xmlns:cx6="http://schemas.microsoft.com/office/drawing/2016/5/12/chartex" xmlns:cx7="http://schemas.microsoft.com/office/drawing/2016/5/13/chartex" xmlns:cx8="http://schemas.microsoft.com/office/drawing/2016/5/14/chartex" xmlns:mc="http://schemas.openxmlformats.org/markup-compatibility/2006" xmlns:aink="http://schemas.microsoft.com/office/drawing/2016/ink" xmlns:am3d="http://schemas.microsoft.com/office/drawing/2017/model3d" xmlns:o="urn:schemas-microsoft-com:office:office" xmlns:oel="http://schemas.microsoft.com/office/2019/extlst" xmlns:r="http://schemas.openxmlformats.org/officeDocument/2006/relationships" xmlns:m="http://schemas.openxmlformats.org/officeDocument/2006/math" xmlns:v="urn:schemas-microsoft-com:vml" xmlns:wp14="http://schemas.microsoft.com/office/word/2010/wordprocessingDrawing" xmlns:wp="http://schemas.openxmlformats.org/drawingml/2006/wordprocessingDrawing" xmlns:w10="urn:schemas-microsoft-com:office:word" xmlns:w="http://schemas.openxmlformats.org/wordprocessingml/2006/main" xmlns:w14="http://schemas.microsoft.com/office/word/2010/wordml" xmlns:w15="http://schemas.microsoft.com/office/word/2012/wordml" xmlns:w16cex="http://schemas.microsoft.com/office/word/2018/wordml/cex" xmlns:w16cid="http://schemas.microsoft.com/office/word/2016/wordml/cid" xmlns:w16="http://schemas.microsoft.com/office/word/2018/wordml" xmlns:w16du="http://schemas.microsoft.com/office/word/2023/wordml/word16du" xmlns:w16sdtdh="http://schemas.microsoft.com/office/word/2020/wordml/sdtdatahash" xmlns:w16sdtfl="http://schemas.microsoft.com/office/word/2024/wordml/sdtformatlock" xmlns:w16se="http://schemas.microsoft.com/office/word/2015/wordml/symex" xmlns:wpg="http://schemas.microsoft.com/office/word/2010/wordprocessingGroup" xmlns:wpi="http://schemas.microsoft.com/office/word/2010/wordprocessingInk" xmlns:wne="http://schemas.microsoft.com/office/word/2006/wordml" xmlns:wps="http://schemas.microsoft.com/office/word/2010/wordprocessingShape" mc:Ignorable="w14 w15 w16se w16cid w16 w16cex w16sdtdh w16sdtfl w16du wp14">
+  <w:abstractNum w:abstractNumId="0" w15:restartNumberingAfterBreak="0">
+    <w:nsid w:val="496E4504"/>
+    <w:multiLevelType w:val="multilevel"/>
+    <w:tmpl w:val="BA946A76"/>
+    <w:lvl w:ilvl="0">
+      <w:start w:val="1"/>
+      <w:numFmt w:val="bullet"/>
+      <w:lvlText w:val=""/>
+      <w:lvlJc w:val="left"/>
+      <w:pPr>
+        <w:tabs>
+          <w:tab w:val="num" w:pos="720"/>
+        </w:tabs>
+        <w:ind w:left="720" w:hanging="360"/>
+      </w:pPr>
+      <w:rPr>
+        <w:rFonts w:ascii="Symbol" w:hAnsi="Symbol" w:hint="default"/>
+        <w:sz w:val="20"/>
+      </w:rPr>
+    </w:lvl>
+    <w:lvl w:ilvl="1" w:tentative="1">
+      <w:start w:val="1"/>
+      <w:numFmt w:val="bullet"/>
+      <w:lvlText w:val="o"/>
+      <w:lvlJc w:val="left"/>
+      <w:pPr>
+        <w:tabs>
+          <w:tab w:val="num" w:pos="1440"/>
+        </w:tabs>
+        <w:ind w:left="1440" w:hanging="360"/>
+      </w:pPr>
+      <w:rPr>
+        <w:rFonts w:ascii="Courier New" w:hAnsi="Courier New" w:hint="default"/>
+        <w:sz w:val="20"/>
+      </w:rPr>
+    </w:lvl>
+    <w:lvl w:ilvl="2" w:tentative="1">
+      <w:start w:val="1"/>
+      <w:numFmt w:val="bullet"/>
+      <w:lvlText w:val=""/>
+      <w:lvlJc w:val="left"/>
+      <w:pPr>
+        <w:tabs>
+          <w:tab w:val="num" w:pos="2160"/>
+        </w:tabs>
+        <w:ind w:left="2160" w:hanging="360"/>
+      </w:pPr>
+      <w:rPr>
+        <w:rFonts w:ascii="Wingdings" w:hAnsi="Wingdings" w:hint="default"/>
+        <w:sz w:val="20"/>
+      </w:rPr>
+    </w:lvl>
+    <w:lvl w:ilvl="3" w:tentative="1">
+      <w:start w:val="1"/>
+      <w:numFmt w:val="bullet"/>
+      <w:lvlText w:val=""/>
+      <w:lvlJc w:val="left"/>
+      <w:pPr>
+        <w:tabs>
+          <w:tab w:val="num" w:pos="2880"/>
+        </w:tabs>
+        <w:ind w:left="2880" w:hanging="360"/>
+      </w:pPr>
+      <w:rPr>
+        <w:rFonts w:ascii="Wingdings" w:hAnsi="Wingdings" w:hint="default"/>
+        <w:sz w:val="20"/>
+      </w:rPr>
+    </w:lvl>
+    <w:lvl w:ilvl="4" w:tentative="1">
+      <w:start w:val="1"/>
+      <w:numFmt w:val="bullet"/>
+      <w:lvlText w:val=""/>
+      <w:lvlJc w:val="left"/>
+      <w:pPr>
+        <w:tabs>
+          <w:tab w:val="num" w:pos="3600"/>
+        </w:tabs>
+        <w:ind w:left="3600" w:hanging="360"/>
+      </w:pPr>
+      <w:rPr>
+        <w:rFonts w:ascii="Wingdings" w:hAnsi="Wingdings" w:hint="default"/>
+        <w:sz w:val="20"/>
+      </w:rPr>
+    </w:lvl>
+    <w:lvl w:ilvl="5" w:tentative="1">
+      <w:start w:val="1"/>
+      <w:numFmt w:val="bullet"/>
+      <w:lvlText w:val=""/>
+      <w:lvlJc w:val="left"/>
+      <w:pPr>
+        <w:tabs>
+          <w:tab w:val="num" w:pos="4320"/>
+        </w:tabs>
+        <w:ind w:left="4320" w:hanging="360"/>
+      </w:pPr>
+      <w:rPr>
+        <w:rFonts w:ascii="Wingdings" w:hAnsi="Wingdings" w:hint="default"/>
+        <w:sz w:val="20"/>
+      </w:rPr>
+    </w:lvl>
+    <w:lvl w:ilvl="6" w:tentative="1">
+      <w:start w:val="1"/>
+      <w:numFmt w:val="bullet"/>
+      <w:lvlText w:val=""/>
+      <w:lvlJc w:val="left"/>
+      <w:pPr>
+        <w:tabs>
+          <w:tab w:val="num" w:pos="5040"/>
+        </w:tabs>
+        <w:ind w:left="5040" w:hanging="360"/>
+      </w:pPr>
+      <w:rPr>
+        <w:rFonts w:ascii="Wingdings" w:hAnsi="Wingdings" w:hint="default"/>
+        <w:sz w:val="20"/>
+      </w:rPr>
+    </w:lvl>
+    <w:lvl w:ilvl="7" w:tentative="1">
+      <w:start w:val="1"/>
+      <w:numFmt w:val="bullet"/>
+      <w:lvlText w:val=""/>
+      <w:lvlJc w:val="left"/>
+      <w:pPr>
+        <w:tabs>
+          <w:tab w:val="num" w:pos="5760"/>
+        </w:tabs>
+        <w:ind w:left="5760" w:hanging="360"/>
+      </w:pPr>
+      <w:rPr>
+        <w:rFonts w:ascii="Wingdings" w:hAnsi="Wingdings" w:hint="default"/>
+        <w:sz w:val="20"/>
+      </w:rPr>
+    </w:lvl>
+    <w:lvl w:ilvl="8" w:tentative="1">
+      <w:start w:val="1"/>
+      <w:numFmt w:val="bullet"/>
+      <w:lvlText w:val=""/>
+      <w:lvlJc w:val="left"/>
+      <w:pPr>
+        <w:tabs>
+          <w:tab w:val="num" w:pos="6480"/>
+        </w:tabs>
+        <w:ind w:left="6480" w:hanging="360"/>
+      </w:pPr>
+      <w:rPr>
+        <w:rFonts w:ascii="Wingdings" w:hAnsi="Wingdings" w:hint="default"/>
+        <w:sz w:val="20"/>
+      </w:rPr>
+    </w:lvl>
+  </w:abstractNum>
+  <w:num w:numId="1" w16cid:durableId="1365401223">
+    <w:abstractNumId w:val="0"/>
+  </w:num>
+</w:numbering>
+</file>
+
 <file path=word/styles.xml><?xml version="1.0" encoding="utf-8"?>
-<w:styles xmlns:mc="http://schemas.openxmlformats.org/markup-compatibility/2006" xmlns:r="http://schemas.openxmlformats.org/officeDocument/2006/relationships" xmlns:w="http://schemas.openxmlformats.org/wordprocessingml/2006/main" xmlns:w14="http://schemas.microsoft.com/office/word/2010/wordml" xmlns:w15="http://schemas.microsoft.com/office/word/2012/wordml" xmlns:w16cex="http://schemas.microsoft.com/office/word/2018/wordml/cex" xmlns:w16cid="http://schemas.microsoft.com/office/word/2016/wordml/cid" xmlns:w16="http://schemas.microsoft.com/office/word/2018/wordml" xmlns:w16sdtdh="http://schemas.microsoft.com/office/word/2020/wordml/sdtdatahash" xmlns:w16se="http://schemas.microsoft.com/office/word/2015/wordml/symex" mc:Ignorable="w14 w15 w16se w16cid w16 w16cex w16sdtdh">
+<w:styles xmlns:mc="http://schemas.openxmlformats.org/markup-compatibility/2006" xmlns:r="http://schemas.openxmlformats.org/officeDocument/2006/relationships" xmlns:w="http://schemas.openxmlformats.org/wordprocessingml/2006/main" xmlns:w14="http://schemas.microsoft.com/office/word/2010/wordml" xmlns:w15="http://schemas.microsoft.com/office/word/2012/wordml" xmlns:w16cex="http://schemas.microsoft.com/office/word/2018/wordml/cex" xmlns:w16cid="http://schemas.microsoft.com/office/word/2016/wordml/cid" xmlns:w16="http://schemas.microsoft.com/office/word/2018/wordml" xmlns:w16du="http://schemas.microsoft.com/office/word/2023/wordml/word16du" xmlns:w16sdtdh="http://schemas.microsoft.com/office/word/2020/wordml/sdtdatahash" xmlns:w16sdtfl="http://schemas.microsoft.com/office/word/2024/wordml/sdtformatlock" xmlns:w16se="http://schemas.microsoft.com/office/word/2015/wordml/symex" mc:Ignorable="w14 w15 w16se w16cid w16 w16cex w16sdtdh w16sdtfl w16du">
   <w:docDefaults>
     <w:rPrDefault>
       <w:rPr>
@@ -3671,7 +3653,6 @@
   <w:style w:type="character" w:default="1" w:styleId="DefaultParagraphFont">
     <w:name w:val="Default Paragraph Font"/>
     <w:uiPriority w:val="1"/>
-    <w:semiHidden/>
     <w:unhideWhenUsed/>
   </w:style>
   <w:style w:type="table" w:default="1" w:styleId="TableNormal">
@@ -4205,6 +4186,17 @@
 </file>
 
 <file path=customXml/item1.xml><?xml version="1.0" encoding="utf-8"?>
+<p:properties xmlns:p="http://schemas.microsoft.com/office/2006/metadata/properties" xmlns:xsi="http://www.w3.org/2001/XMLSchema-instance" xmlns:pc="http://schemas.microsoft.com/office/infopath/2007/PartnerControls">
+  <documentManagement>
+    <TaxCatchAll xmlns="6a3343e3-a342-4977-82e8-547b9d40dd28" xsi:nil="true"/>
+    <lcf76f155ced4ddcb4097134ff3c332f xmlns="122b6bc9-85c8-4cf1-91e6-8e70987f848c">
+      <Terms xmlns="http://schemas.microsoft.com/office/infopath/2007/PartnerControls"/>
+    </lcf76f155ced4ddcb4097134ff3c332f>
+  </documentManagement>
+</p:properties>
+</file>
+
+<file path=customXml/item2.xml><?xml version="1.0" encoding="utf-8"?>
 <ct:contentTypeSchema xmlns:ct="http://schemas.microsoft.com/office/2006/metadata/contentType" xmlns:ma="http://schemas.microsoft.com/office/2006/metadata/properties/metaAttributes" ct:_="" ma:_="" ma:contentTypeName="Document" ma:contentTypeID="0x010100DAB4865CE0063E4C863866F234696B4D" ma:contentTypeVersion="11" ma:contentTypeDescription="Create a new document." ma:contentTypeScope="" ma:versionID="dc68f9ba90de6bdc71dcd44eaa64d902">
   <xsd:schema xmlns:xsd="http://www.w3.org/2001/XMLSchema" xmlns:xs="http://www.w3.org/2001/XMLSchema" xmlns:p="http://schemas.microsoft.com/office/2006/metadata/properties" xmlns:ns2="122b6bc9-85c8-4cf1-91e6-8e70987f848c" xmlns:ns3="6a3343e3-a342-4977-82e8-547b9d40dd28" targetNamespace="http://schemas.microsoft.com/office/2006/metadata/properties" ma:root="true" ma:fieldsID="14f7a31914c7b408390499466c8b176f" ns2:_="" ns3:_="">
     <xsd:import namespace="122b6bc9-85c8-4cf1-91e6-8e70987f848c"/>
@@ -4399,17 +4391,6 @@
 </ct:contentTypeSchema>
 </file>
 
-<file path=customXml/item2.xml><?xml version="1.0" encoding="utf-8"?>
-<p:properties xmlns:p="http://schemas.microsoft.com/office/2006/metadata/properties" xmlns:xsi="http://www.w3.org/2001/XMLSchema-instance" xmlns:pc="http://schemas.microsoft.com/office/infopath/2007/PartnerControls">
-  <documentManagement>
-    <TaxCatchAll xmlns="6a3343e3-a342-4977-82e8-547b9d40dd28" xsi:nil="true"/>
-    <lcf76f155ced4ddcb4097134ff3c332f xmlns="122b6bc9-85c8-4cf1-91e6-8e70987f848c">
-      <Terms xmlns="http://schemas.microsoft.com/office/infopath/2007/PartnerControls"/>
-    </lcf76f155ced4ddcb4097134ff3c332f>
-  </documentManagement>
-</p:properties>
-</file>
-
 <file path=customXml/item3.xml><?xml version="1.0" encoding="utf-8"?>
 <?mso-contentType ?>
 <FormTemplates xmlns="http://schemas.microsoft.com/sharepoint/v3/contenttype/forms">
@@ -4420,16 +4401,31 @@
 </file>
 
 <file path=customXml/itemProps1.xml><?xml version="1.0" encoding="utf-8"?>
-<ds:datastoreItem xmlns:ds="http://schemas.openxmlformats.org/officeDocument/2006/customXml" ds:itemID="{4E811B6F-1B21-4B77-93E5-EA46950DDF42}"/>
-</file>
-
-<file path=customXml/itemProps2.xml><?xml version="1.0" encoding="utf-8"?>
 <ds:datastoreItem xmlns:ds="http://schemas.openxmlformats.org/officeDocument/2006/customXml" ds:itemID="{68F97C91-8AAA-4241-BFB3-79DE058C21C2}">
   <ds:schemaRefs>
     <ds:schemaRef ds:uri="http://schemas.microsoft.com/office/2006/metadata/properties"/>
     <ds:schemaRef ds:uri="http://schemas.microsoft.com/office/infopath/2007/PartnerControls"/>
-    <ds:schemaRef ds:uri="0ef7128f-a7d0-43d2-bee4-5f56f49c64da"/>
-    <ds:schemaRef ds:uri="6d95bc28-2e5c-4ccd-92aa-ea746d833732"/>
+    <ds:schemaRef ds:uri="6a3343e3-a342-4977-82e8-547b9d40dd28"/>
+    <ds:schemaRef ds:uri="122b6bc9-85c8-4cf1-91e6-8e70987f848c"/>
+  </ds:schemaRefs>
+</ds:datastoreItem>
+</file>
+
+<file path=customXml/itemProps2.xml><?xml version="1.0" encoding="utf-8"?>
+<ds:datastoreItem xmlns:ds="http://schemas.openxmlformats.org/officeDocument/2006/customXml" ds:itemID="{4E811B6F-1B21-4B77-93E5-EA46950DDF42}">
+  <ds:schemaRefs>
+    <ds:schemaRef ds:uri="http://schemas.microsoft.com/office/2006/metadata/contentType"/>
+    <ds:schemaRef ds:uri="http://schemas.microsoft.com/office/2006/metadata/properties/metaAttributes"/>
+    <ds:schemaRef ds:uri="http://www.w3.org/2001/XMLSchema"/>
+    <ds:schemaRef ds:uri="http://schemas.microsoft.com/office/2006/metadata/properties"/>
+    <ds:schemaRef ds:uri="122b6bc9-85c8-4cf1-91e6-8e70987f848c"/>
+    <ds:schemaRef ds:uri="6a3343e3-a342-4977-82e8-547b9d40dd28"/>
+    <ds:schemaRef ds:uri="http://schemas.microsoft.com/office/2006/documentManagement/types"/>
+    <ds:schemaRef ds:uri="http://schemas.microsoft.com/office/infopath/2007/PartnerControls"/>
+    <ds:schemaRef ds:uri="http://schemas.openxmlformats.org/package/2006/metadata/core-properties"/>
+    <ds:schemaRef ds:uri="http://purl.org/dc/elements/1.1/"/>
+    <ds:schemaRef ds:uri="http://purl.org/dc/terms/"/>
+    <ds:schemaRef ds:uri="http://schemas.microsoft.com/internal/obd"/>
   </ds:schemaRefs>
 </ds:datastoreItem>
 </file>

</xml_diff>